<commit_message>
fix: (server/services/contractDocumentService.js) sanitize template default fallbacks and update contract template
</commit_message>
<xml_diff>
--- a/server/templates/CONTRATO_TEMPLATE.docx
+++ b/server/templates/CONTRATO_TEMPLATE.docx
@@ -258,7 +258,7 @@
                 <w:sz w:val="20"/>
                 <w:lang w:val="es-CO"/>
               </w:rPr>
-              <w:t>} - documento de identidad {</w:t>
+              <w:t>} -  {</w:t>
             </w:r>
             <w:proofErr w:type="spellStart"/>
             <w:r>
@@ -2484,23 +2484,13 @@
                 <w:lang w:val="es-CO"/>
               </w:rPr>
             </w:pPr>
-            <w:proofErr w:type="gramStart"/>
             <w:r>
               <w:rPr>
                 <w:b/>
                 <w:sz w:val="20"/>
                 <w:lang w:val="es-CO"/>
               </w:rPr>
-              <w:t>TOTAL</w:t>
-            </w:r>
-            <w:proofErr w:type="gramEnd"/>
-            <w:r>
-              <w:rPr>
-                <w:b/>
-                <w:sz w:val="20"/>
-                <w:lang w:val="es-CO"/>
-              </w:rPr>
-              <w:t xml:space="preserve"> DE LOS {</w:t>
+              <w:t>TOTAL DE LOS {</w:t>
             </w:r>
             <w:proofErr w:type="spellStart"/>
             <w:r>
@@ -2701,23 +2691,13 @@
                 <w:lang w:val="es-MX"/>
               </w:rPr>
             </w:pPr>
-            <w:proofErr w:type="gramStart"/>
             <w:r>
               <w:rPr>
                 <w:bCs/>
                 <w:sz w:val="20"/>
                 <w:lang w:val="es-MX"/>
               </w:rPr>
-              <w:t>TOTAL</w:t>
-            </w:r>
-            <w:proofErr w:type="gramEnd"/>
-            <w:r>
-              <w:rPr>
-                <w:bCs/>
-                <w:sz w:val="20"/>
-                <w:lang w:val="es-MX"/>
-              </w:rPr>
-              <w:t xml:space="preserve"> APLICADO AL PRÉSTAMO UPAY</w:t>
+              <w:t>TOTAL APLICADO AL PRÉSTAMO UPAY</w:t>
             </w:r>
           </w:p>
         </w:tc>
@@ -2771,21 +2751,12 @@
                 <w:lang w:val="es-MX"/>
               </w:rPr>
             </w:pPr>
-            <w:proofErr w:type="gramStart"/>
             <w:r>
               <w:rPr>
                 <w:sz w:val="20"/>
                 <w:lang w:val="es-MX"/>
               </w:rPr>
-              <w:t>Total</w:t>
-            </w:r>
-            <w:proofErr w:type="gramEnd"/>
-            <w:r>
-              <w:rPr>
-                <w:sz w:val="20"/>
-                <w:lang w:val="es-MX"/>
-              </w:rPr>
-              <w:t xml:space="preserve"> aplicado a SmartBike Cloud</w:t>
+              <w:t>Total aplicado a SmartBike Cloud</w:t>
             </w:r>
           </w:p>
         </w:tc>
@@ -3881,7 +3852,77 @@
                 <w:sz w:val="20"/>
                 <w:lang w:val="es-CO"/>
               </w:rPr>
-              <w:t>Dirección: [COMPLETAR] | Teléfono: [COMPLETAR] | Correo: [COMPLETAR]</w:t>
+              <w:t>CALLE 13B 62 26</w:t>
+            </w:r>
+            <w:r>
+              <w:rPr>
+                <w:sz w:val="20"/>
+                <w:lang w:val="es-CO"/>
+              </w:rPr>
+              <w:t xml:space="preserve">, </w:t>
+            </w:r>
+            <w:r>
+              <w:rPr>
+                <w:sz w:val="20"/>
+                <w:lang w:val="es-CO"/>
+              </w:rPr>
+              <w:t>LA GLORIA</w:t>
+            </w:r>
+            <w:r>
+              <w:rPr>
+                <w:sz w:val="20"/>
+                <w:lang w:val="es-CO"/>
+              </w:rPr>
+              <w:t xml:space="preserve">, </w:t>
+            </w:r>
+            <w:r>
+              <w:rPr>
+                <w:sz w:val="20"/>
+                <w:lang w:val="es-CO"/>
+              </w:rPr>
+              <w:t>Cartagena</w:t>
+            </w:r>
+            <w:r>
+              <w:rPr>
+                <w:sz w:val="20"/>
+                <w:lang w:val="es-CO"/>
+              </w:rPr>
+              <w:t xml:space="preserve"> </w:t>
+            </w:r>
+            <w:r>
+              <w:rPr>
+                <w:sz w:val="20"/>
+                <w:lang w:val="es-CO"/>
+              </w:rPr>
+              <w:t xml:space="preserve">| </w:t>
+            </w:r>
+            <w:r>
+              <w:rPr>
+                <w:sz w:val="20"/>
+                <w:lang w:val="es-CO"/>
+              </w:rPr>
+              <w:t>3332522438</w:t>
+            </w:r>
+            <w:r>
+              <w:rPr>
+                <w:sz w:val="20"/>
+                <w:lang w:val="es-CO"/>
+              </w:rPr>
+              <w:t xml:space="preserve"> </w:t>
+            </w:r>
+            <w:r>
+              <w:rPr>
+                <w:sz w:val="20"/>
+                <w:lang w:val="es-CO"/>
+              </w:rPr>
+              <w:t xml:space="preserve">| </w:t>
+            </w:r>
+            <w:r>
+              <w:rPr>
+                <w:sz w:val="20"/>
+                <w:lang w:val="es-CO"/>
+              </w:rPr>
+              <w:t>upaysolutionssas@gmail.com</w:t>
             </w:r>
           </w:p>
         </w:tc>
@@ -3939,7 +3980,70 @@
                 <w:sz w:val="20"/>
                 <w:lang w:val="es-MX"/>
               </w:rPr>
-              <w:t>Calle 31 # 50-86, Cartagena | {vendedorTelefono} | administracion.motosazvi@gmail.com</w:t>
+              <w:t>CALLE REAL No. 19-93</w:t>
+            </w:r>
+            <w:r>
+              <w:rPr>
+                <w:sz w:val="20"/>
+                <w:lang w:val="es-MX"/>
+              </w:rPr>
+              <w:t xml:space="preserve">, </w:t>
+            </w:r>
+            <w:r>
+              <w:rPr>
+                <w:sz w:val="20"/>
+                <w:lang w:val="es-MX"/>
+              </w:rPr>
+              <w:t>TURBACO, BOLIVAR</w:t>
+            </w:r>
+            <w:r>
+              <w:rPr>
+                <w:sz w:val="20"/>
+                <w:lang w:val="es-MX"/>
+              </w:rPr>
+              <w:t xml:space="preserve"> </w:t>
+            </w:r>
+            <w:r>
+              <w:rPr>
+                <w:sz w:val="20"/>
+                <w:lang w:val="es-MX"/>
+              </w:rPr>
+              <w:t xml:space="preserve"> </w:t>
+            </w:r>
+            <w:r>
+              <w:rPr>
+                <w:sz w:val="20"/>
+                <w:lang w:val="es-MX"/>
+              </w:rPr>
+              <w:t>|</w:t>
+            </w:r>
+            <w:r>
+              <w:rPr>
+                <w:sz w:val="20"/>
+                <w:lang w:val="es-MX"/>
+              </w:rPr>
+              <w:t xml:space="preserve"> 3004224332</w:t>
+            </w:r>
+            <w:r>
+              <w:rPr>
+                <w:sz w:val="20"/>
+                <w:lang w:val="es-MX"/>
+              </w:rPr>
+              <w:t xml:space="preserve">  | </w:t>
+            </w:r>
+            <w:r>
+              <w:rPr>
+                <w:sz w:val="20"/>
+                <w:lang w:val="es-MX"/>
+              </w:rPr>
+              <w:t>pocketbikesas</w:t>
+            </w:r>
+            <w:r>
+              <w:rPr>
+                <w:sz w:val="20"/>
+                <w:lang w:val="es-MX"/>
+              </w:rPr>
+              <w:t>@gmail.com</w:t>
             </w:r>
           </w:p>
         </w:tc>
@@ -4029,7 +4133,7 @@
                 <w:sz w:val="20"/>
                 <w:lang w:val="es-CO"/>
               </w:rPr>
-              <w:t>} | Dirección: {</w:t>
+              <w:t>} |  {</w:t>
             </w:r>
             <w:proofErr w:type="spellStart"/>
             <w:r>
@@ -4045,7 +4149,7 @@
                 <w:sz w:val="20"/>
                 <w:lang w:val="es-CO"/>
               </w:rPr>
-              <w:t>} | Teléfono: {</w:t>
+              <w:t>} |  {</w:t>
             </w:r>
             <w:proofErr w:type="spellStart"/>
             <w:r>
@@ -4061,7 +4165,7 @@
                 <w:sz w:val="20"/>
                 <w:lang w:val="es-CO"/>
               </w:rPr>
-              <w:t>} | Correo: {</w:t>
+              <w:t>} |  {</w:t>
             </w:r>
             <w:proofErr w:type="spellStart"/>
             <w:r>
@@ -4467,7 +4571,15 @@
                 <w:lang w:val="es-MX"/>
               </w:rPr>
               <w:br/>
-              <w:t>C.C.: _________________________</w:t>
+              <w:t xml:space="preserve">C.C.: </w:t>
+            </w:r>
+            <w:r>
+              <w:rPr>
+                <w:b/>
+                <w:sz w:val="20"/>
+                <w:lang w:val="es-MX"/>
+              </w:rPr>
+              <w:t>1.143.368.809</w:t>
             </w:r>
             <w:r>
               <w:rPr>
@@ -16317,6 +16429,29 @@
       </w:tcPr>
     </w:tblStylePr>
   </w:style>
+  <w:style w:type="character" w:styleId="Hyperlink">
+    <w:name w:val="Hyperlink"/>
+    <w:basedOn w:val="DefaultParagraphFont"/>
+    <w:uiPriority w:val="99"/>
+    <w:unhideWhenUsed/>
+    <w:rsid w:val="004A4B5D"/>
+    <w:rPr>
+      <w:color w:val="0000FF" w:themeColor="hyperlink"/>
+      <w:u w:val="single"/>
+    </w:rPr>
+  </w:style>
+  <w:style w:type="character" w:styleId="UnresolvedMention">
+    <w:name w:val="Unresolved Mention"/>
+    <w:basedOn w:val="DefaultParagraphFont"/>
+    <w:uiPriority w:val="99"/>
+    <w:semiHidden/>
+    <w:unhideWhenUsed/>
+    <w:rsid w:val="004A4B5D"/>
+    <w:rPr>
+      <w:color w:val="605E5C"/>
+      <w:shd w:val="clear" w:color="auto" w:fill="E1DFDD"/>
+    </w:rPr>
+  </w:style>
 </w:styles>
 </file>
 

</xml_diff>